<commit_message>
Remove human-in-loop/SME from vision doc: content supply path is now fully autonomous (reflection + provenance)
</commit_message>
<xml_diff>
--- a/KM-Future-Vision.docx
+++ b/KM-Future-Vision.docx
@@ -368,7 +368,7 @@
           <w:i w:val="false"/>
           <w:iCs w:val="false"/>
         </w:rPr>
-        <w:t xml:space="preserve">Leading agents combine multimodal input (chat, voice, image, document), classify intent at high accuracy, and personalize using customer history and real-time context — moving from reactive replies toward proactive, even predictive intervention. Human experts are re-skilled to own the ambiguous, high-risk cases and to supervise the AI.</w:t>
+        <w:t xml:space="preserve">Leading agents combine multimodal input (chat, voice, image, document), classify intent at high accuracy, and personalize using customer history and real-time context — moving from reactive replies toward proactive, even predictive intervention. Accuracy is upheld by automated reflection and provenance rather than manual review.</w:t>
       </w:r>
     </w:p>
     <w:p>
@@ -1331,7 +1331,7 @@
                 <w:sz w:val="20"/>
                 <w:szCs w:val="20"/>
               </w:rPr>
-              <w:t xml:space="preserve">Managed Content → SME → Evergreen; case notes; New Product Introduction / product team; Community</w:t>
+              <w:t xml:space="preserve">Managed Content → Evergreen; case notes; New Product Introduction / product team; Community</w:t>
             </w:r>
           </w:p>
         </w:tc>
@@ -2007,7 +2007,7 @@
           <w:i w:val="false"/>
           <w:iCs w:val="false"/>
         </w:rPr>
-        <w:t xml:space="preserve">The flow: a production-bound code commit raises a change signal; an always-on listener detects and evaluates it; it crawls the primary self-serve surfaces to find every asset the change could impact; it auto-generates a work-item ticket with an AI draft of each affected asset, assigned to the right product and support SMEs; the SMEs review and iterate; and publishing is scheduled to the product deploy date. Two AI-generated outputs fall out of it — a “pre-release notes” forward view of what is launching, and a short training video of the changes and how customers will use them.</w:t>
+        <w:t xml:space="preserve">The flow: a production-bound code commit raises a change signal; an always-on listener detects and evaluates it; it crawls the primary self-serve surfaces to find every asset the change could impact; it auto-generates an AI draft of each affected asset and self-validates it against source (reflection + provenance + confidence thresholds); and publishing is scheduled to the product deploy date. Two AI-generated outputs fall out of it — a “pre-release notes” forward view of what is launching, and a short training video of the changes and how customers will use them.</w:t>
       </w:r>
     </w:p>
     <w:p>
@@ -2045,7 +2045,7 @@
           <w:i w:val="false"/>
           <w:iCs w:val="false"/>
         </w:rPr>
-        <w:t xml:space="preserve">Auto-drafted, SME-validated updates via a work-item ticket, published to the deploy date — the supply path, human-validated.</w:t>
+        <w:t xml:space="preserve">Auto-drafted, self-validated (reflection + provenance) updates published to the deploy date — the supply path, fully autonomous.</w:t>
       </w:r>
     </w:p>
     <w:p>
@@ -3100,7 +3100,7 @@
                 <w:sz w:val="20"/>
                 <w:szCs w:val="20"/>
               </w:rPr>
-              <w:t xml:space="preserve">Reflection, provenance, confidence thresholds and human-in-loop for gray areas keep accuracy at the customer’s bar.</w:t>
+              <w:t xml:space="preserve">Reflection, provenance, confidence thresholds and automated re-verification for gray areas keep accuracy at the customer’s bar.</w:t>
             </w:r>
           </w:p>
         </w:tc>

</xml_diff>